<commit_message>
Documentación bosque de setas parte2
</commit_message>
<xml_diff>
--- a/Documentación Bosque de Setas.docx
+++ b/Documentación Bosque de Setas.docx
@@ -68,68 +68,91 @@
     </w:p>
     <w:p/>
     <w:p>
-      <w:r>
-        <w:t xml:space="preserve">- </w:t>
-      </w:r>
+      <w:pPr>
+        <w:pStyle w:val="Prrafodelista"/>
+        <w:numPr>
+          <w:ilvl w:val="0"/>
+          <w:numId w:val="1"/>
+        </w:numPr>
+      </w:pPr>
       <w:r>
         <w:rPr>
           <w:b/>
           <w:bCs/>
         </w:rPr>
-        <w:t>**10 setas normales**</w:t>
-      </w:r>
-      <w:r>
-        <w:t xml:space="preserve"> (clase `.mushroom`, `data-mushroom-type="normal"`) repartidas por el mapa.</w:t>
-      </w:r>
-    </w:p>
-    <w:p>
-      <w:r>
-        <w:t xml:space="preserve">- </w:t>
-      </w:r>
+        <w:t>10 setas normales</w:t>
+      </w:r>
+      <w:r>
+        <w:t xml:space="preserve"> (clase .mushroom, data-mushroom-type="normal") repartidas por el mapa.</w:t>
+      </w:r>
+    </w:p>
+    <w:p>
+      <w:pPr>
+        <w:pStyle w:val="Prrafodelista"/>
+        <w:numPr>
+          <w:ilvl w:val="0"/>
+          <w:numId w:val="1"/>
+        </w:numPr>
+      </w:pPr>
       <w:r>
         <w:rPr>
           <w:b/>
           <w:bCs/>
         </w:rPr>
-        <w:t>**1 seta especial**</w:t>
-      </w:r>
-      <w:r>
-        <w:t xml:space="preserve"> (clase `.mushroom.special`, `data-mushroom-type="special"`) que resetea el temporizador a 30s.</w:t>
-      </w:r>
-    </w:p>
-    <w:p>
-      <w:r>
-        <w:t xml:space="preserve">- </w:t>
-      </w:r>
+        <w:t>1 seta especial</w:t>
+      </w:r>
+      <w:r>
+        <w:t xml:space="preserve"> (clase .mushroom.special, data-mushroom-type="special") que resetea el temporizador a 30s.</w:t>
+      </w:r>
+    </w:p>
+    <w:p>
+      <w:pPr>
+        <w:pStyle w:val="Prrafodelista"/>
+        <w:numPr>
+          <w:ilvl w:val="0"/>
+          <w:numId w:val="1"/>
+        </w:numPr>
+      </w:pPr>
       <w:r>
         <w:rPr>
           <w:b/>
           <w:bCs/>
         </w:rPr>
-        <w:t>**Temporizador descendente**</w:t>
-      </w:r>
-      <w:r>
-        <w:t xml:space="preserve"> de 30 segundos mostrado como overlay HTML (`createUI()`).</w:t>
-      </w:r>
-    </w:p>
-    <w:p>
-      <w:r>
-        <w:t xml:space="preserve">- </w:t>
-      </w:r>
+        <w:t>Temporizador descendente</w:t>
+      </w:r>
+      <w:r>
+        <w:t xml:space="preserve"> de 30 segundos mostrado como overlay HTML (createUI()).</w:t>
+      </w:r>
+    </w:p>
+    <w:p>
+      <w:pPr>
+        <w:pStyle w:val="Prrafodelista"/>
+        <w:numPr>
+          <w:ilvl w:val="0"/>
+          <w:numId w:val="1"/>
+        </w:numPr>
+      </w:pPr>
       <w:r>
         <w:rPr>
           <w:b/>
           <w:bCs/>
         </w:rPr>
-        <w:t>**Detección por proximidad**</w:t>
-      </w:r>
-      <w:r>
-        <w:t>: un loop en `requestAnimationFrame` calcula la distancia horizontal (XZ) entre el jugador y cada seta. Si la distancia &lt; 1.5m, se recoge.</w:t>
-      </w:r>
-    </w:p>
-    <w:p>
-      <w:r>
-        <w:t>- Al recogerse, la seta se anima (encogimiento + rotación) y se elimina del DOM.</w:t>
+        <w:t>Detección por proximidad</w:t>
+      </w:r>
+      <w:r>
+        <w:t>: un loop en requestAnimationFrame calcula la distancia horizontal (XZ) entre el jugador y cada seta. Si la distancia &lt; 1.5m, se recoge.</w:t>
+      </w:r>
+    </w:p>
+    <w:p>
+      <w:pPr>
+        <w:pStyle w:val="Prrafodelista"/>
+        <w:numPr>
+          <w:ilvl w:val="0"/>
+          <w:numId w:val="1"/>
+        </w:numPr>
+      </w:pPr>
+      <w:r>
+        <w:t>Al recogerse, la seta se anima (encogimiento + rotación) y se elimina del DOM.</w:t>
       </w:r>
     </w:p>
     <w:p/>
@@ -448,6 +471,127 @@
     </w:sectPr>
   </w:body>
 </w:document>
+</file>
+
+<file path=word/numbering.xml><?xml version="1.0" encoding="utf-8"?>
+<w:numbering xmlns:wpc="http://schemas.microsoft.com/office/word/2010/wordprocessingCanvas" xmlns:cx="http://schemas.microsoft.com/office/drawing/2014/chartex" xmlns:cx1="http://schemas.microsoft.com/office/drawing/2015/9/8/chartex" xmlns:cx2="http://schemas.microsoft.com/office/drawing/2015/10/21/chartex" xmlns:cx3="http://schemas.microsoft.com/office/drawing/2016/5/9/chartex" xmlns:cx4="http://schemas.microsoft.com/office/drawing/2016/5/10/chartex" xmlns:cx5="http://schemas.microsoft.com/office/drawing/2016/5/11/chartex" xmlns:cx6="http://schemas.microsoft.com/office/drawing/2016/5/12/chartex" xmlns:cx7="http://schemas.microsoft.com/office/drawing/2016/5/13/chartex" xmlns:cx8="http://schemas.microsoft.com/office/drawing/2016/5/14/chartex" xmlns:mc="http://schemas.openxmlformats.org/markup-compatibility/2006" xmlns:aink="http://schemas.microsoft.com/office/drawing/2016/ink" xmlns:am3d="http://schemas.microsoft.com/office/drawing/2017/model3d" xmlns:o="urn:schemas-microsoft-com:office:office" xmlns:oel="http://schemas.microsoft.com/office/2019/extlst" xmlns:r="http://schemas.openxmlformats.org/officeDocument/2006/relationships" xmlns:m="http://schemas.openxmlformats.org/officeDocument/2006/math" xmlns:v="urn:schemas-microsoft-com:vml" xmlns:wp14="http://schemas.microsoft.com/office/word/2010/wordprocessingDrawing" xmlns:wp="http://schemas.openxmlformats.org/drawingml/2006/wordprocessingDrawing" xmlns:w10="urn:schemas-microsoft-com:office:word" xmlns:w="http://schemas.openxmlformats.org/wordprocessingml/2006/main" xmlns:w14="http://schemas.microsoft.com/office/word/2010/wordml" xmlns:w15="http://schemas.microsoft.com/office/word/2012/wordml" xmlns:w16cex="http://schemas.microsoft.com/office/word/2018/wordml/cex" xmlns:w16cid="http://schemas.microsoft.com/office/word/2016/wordml/cid" xmlns:w16="http://schemas.microsoft.com/office/word/2018/wordml" xmlns:w16du="http://schemas.microsoft.com/office/word/2023/wordml/word16du" xmlns:w16sdtdh="http://schemas.microsoft.com/office/word/2020/wordml/sdtdatahash" xmlns:w16sdtfl="http://schemas.microsoft.com/office/word/2024/wordml/sdtformatlock" xmlns:w16se="http://schemas.microsoft.com/office/word/2015/wordml/symex" xmlns:wpg="http://schemas.microsoft.com/office/word/2010/wordprocessingGroup" xmlns:wpi="http://schemas.microsoft.com/office/word/2010/wordprocessingInk" xmlns:wne="http://schemas.microsoft.com/office/word/2006/wordml" xmlns:wps="http://schemas.microsoft.com/office/word/2010/wordprocessingShape" mc:Ignorable="w14 w15 w16se w16cid w16 w16cex w16sdtdh w16sdtfl w16du wp14">
+  <w:abstractNum w:abstractNumId="0" w15:restartNumberingAfterBreak="0">
+    <w:nsid w:val="7EA440D6"/>
+    <w:multiLevelType w:val="hybridMultilevel"/>
+    <w:tmpl w:val="43128670"/>
+    <w:lvl w:ilvl="0" w:tplc="0C0A0001">
+      <w:start w:val="1"/>
+      <w:numFmt w:val="bullet"/>
+      <w:lvlText w:val=""/>
+      <w:lvlJc w:val="left"/>
+      <w:pPr>
+        <w:ind w:left="720" w:hanging="360"/>
+      </w:pPr>
+      <w:rPr>
+        <w:rFonts w:ascii="Symbol" w:hAnsi="Symbol" w:hint="default"/>
+      </w:rPr>
+    </w:lvl>
+    <w:lvl w:ilvl="1" w:tplc="0C0A0003" w:tentative="1">
+      <w:start w:val="1"/>
+      <w:numFmt w:val="bullet"/>
+      <w:lvlText w:val="o"/>
+      <w:lvlJc w:val="left"/>
+      <w:pPr>
+        <w:ind w:left="1440" w:hanging="360"/>
+      </w:pPr>
+      <w:rPr>
+        <w:rFonts w:ascii="Courier New" w:hAnsi="Courier New" w:cs="Courier New" w:hint="default"/>
+      </w:rPr>
+    </w:lvl>
+    <w:lvl w:ilvl="2" w:tplc="0C0A0005" w:tentative="1">
+      <w:start w:val="1"/>
+      <w:numFmt w:val="bullet"/>
+      <w:lvlText w:val=""/>
+      <w:lvlJc w:val="left"/>
+      <w:pPr>
+        <w:ind w:left="2160" w:hanging="360"/>
+      </w:pPr>
+      <w:rPr>
+        <w:rFonts w:ascii="Wingdings" w:hAnsi="Wingdings" w:hint="default"/>
+      </w:rPr>
+    </w:lvl>
+    <w:lvl w:ilvl="3" w:tplc="0C0A0001" w:tentative="1">
+      <w:start w:val="1"/>
+      <w:numFmt w:val="bullet"/>
+      <w:lvlText w:val=""/>
+      <w:lvlJc w:val="left"/>
+      <w:pPr>
+        <w:ind w:left="2880" w:hanging="360"/>
+      </w:pPr>
+      <w:rPr>
+        <w:rFonts w:ascii="Symbol" w:hAnsi="Symbol" w:hint="default"/>
+      </w:rPr>
+    </w:lvl>
+    <w:lvl w:ilvl="4" w:tplc="0C0A0003" w:tentative="1">
+      <w:start w:val="1"/>
+      <w:numFmt w:val="bullet"/>
+      <w:lvlText w:val="o"/>
+      <w:lvlJc w:val="left"/>
+      <w:pPr>
+        <w:ind w:left="3600" w:hanging="360"/>
+      </w:pPr>
+      <w:rPr>
+        <w:rFonts w:ascii="Courier New" w:hAnsi="Courier New" w:cs="Courier New" w:hint="default"/>
+      </w:rPr>
+    </w:lvl>
+    <w:lvl w:ilvl="5" w:tplc="0C0A0005" w:tentative="1">
+      <w:start w:val="1"/>
+      <w:numFmt w:val="bullet"/>
+      <w:lvlText w:val=""/>
+      <w:lvlJc w:val="left"/>
+      <w:pPr>
+        <w:ind w:left="4320" w:hanging="360"/>
+      </w:pPr>
+      <w:rPr>
+        <w:rFonts w:ascii="Wingdings" w:hAnsi="Wingdings" w:hint="default"/>
+      </w:rPr>
+    </w:lvl>
+    <w:lvl w:ilvl="6" w:tplc="0C0A0001" w:tentative="1">
+      <w:start w:val="1"/>
+      <w:numFmt w:val="bullet"/>
+      <w:lvlText w:val=""/>
+      <w:lvlJc w:val="left"/>
+      <w:pPr>
+        <w:ind w:left="5040" w:hanging="360"/>
+      </w:pPr>
+      <w:rPr>
+        <w:rFonts w:ascii="Symbol" w:hAnsi="Symbol" w:hint="default"/>
+      </w:rPr>
+    </w:lvl>
+    <w:lvl w:ilvl="7" w:tplc="0C0A0003" w:tentative="1">
+      <w:start w:val="1"/>
+      <w:numFmt w:val="bullet"/>
+      <w:lvlText w:val="o"/>
+      <w:lvlJc w:val="left"/>
+      <w:pPr>
+        <w:ind w:left="5760" w:hanging="360"/>
+      </w:pPr>
+      <w:rPr>
+        <w:rFonts w:ascii="Courier New" w:hAnsi="Courier New" w:cs="Courier New" w:hint="default"/>
+      </w:rPr>
+    </w:lvl>
+    <w:lvl w:ilvl="8" w:tplc="0C0A0005" w:tentative="1">
+      <w:start w:val="1"/>
+      <w:numFmt w:val="bullet"/>
+      <w:lvlText w:val=""/>
+      <w:lvlJc w:val="left"/>
+      <w:pPr>
+        <w:ind w:left="6480" w:hanging="360"/>
+      </w:pPr>
+      <w:rPr>
+        <w:rFonts w:ascii="Wingdings" w:hAnsi="Wingdings" w:hint="default"/>
+      </w:rPr>
+    </w:lvl>
+  </w:abstractNum>
+  <w:num w:numId="1" w16cid:durableId="2084645026">
+    <w:abstractNumId w:val="0"/>
+  </w:num>
+</w:numbering>
 </file>
 
 <file path=word/styles.xml><?xml version="1.0" encoding="utf-8"?>
@@ -1051,6 +1195,7 @@
   <w:style w:type="character" w:default="1" w:styleId="Fuentedeprrafopredeter">
     <w:name w:val="Default Paragraph Font"/>
     <w:uiPriority w:val="1"/>
+    <w:semiHidden/>
     <w:unhideWhenUsed/>
   </w:style>
   <w:style w:type="table" w:default="1" w:styleId="Tablanormal">

</xml_diff>

<commit_message>
actualizacion documentacion bosque de setas
</commit_message>
<xml_diff>
--- a/Documentación Bosque de Setas.docx
+++ b/Documentación Bosque de Setas.docx
@@ -1,6 +1,6 @@
 
 <file path=word/document.xml><?xml version="1.0" encoding="utf-8"?>
-<w:document xmlns:wpc="http://schemas.microsoft.com/office/word/2010/wordprocessingCanvas" xmlns:cx="http://schemas.microsoft.com/office/drawing/2014/chartex" xmlns:cx1="http://schemas.microsoft.com/office/drawing/2015/9/8/chartex" xmlns:cx2="http://schemas.microsoft.com/office/drawing/2015/10/21/chartex" xmlns:cx3="http://schemas.microsoft.com/office/drawing/2016/5/9/chartex" xmlns:cx4="http://schemas.microsoft.com/office/drawing/2016/5/10/chartex" xmlns:cx5="http://schemas.microsoft.com/office/drawing/2016/5/11/chartex" xmlns:cx6="http://schemas.microsoft.com/office/drawing/2016/5/12/chartex" xmlns:cx7="http://schemas.microsoft.com/office/drawing/2016/5/13/chartex" xmlns:cx8="http://schemas.microsoft.com/office/drawing/2016/5/14/chartex" xmlns:mc="http://schemas.openxmlformats.org/markup-compatibility/2006" xmlns:aink="http://schemas.microsoft.com/office/drawing/2016/ink" xmlns:am3d="http://schemas.microsoft.com/office/drawing/2017/model3d" xmlns:o="urn:schemas-microsoft-com:office:office" xmlns:oel="http://schemas.microsoft.com/office/2019/extlst" xmlns:r="http://schemas.openxmlformats.org/officeDocument/2006/relationships" xmlns:m="http://schemas.openxmlformats.org/officeDocument/2006/math" xmlns:v="urn:schemas-microsoft-com:vml" xmlns:wp14="http://schemas.microsoft.com/office/word/2010/wordprocessingDrawing" xmlns:wp="http://schemas.openxmlformats.org/drawingml/2006/wordprocessingDrawing" xmlns:w10="urn:schemas-microsoft-com:office:word" xmlns:w="http://schemas.openxmlformats.org/wordprocessingml/2006/main" xmlns:w14="http://schemas.microsoft.com/office/word/2010/wordml" xmlns:w15="http://schemas.microsoft.com/office/word/2012/wordml" xmlns:w16cex="http://schemas.microsoft.com/office/word/2018/wordml/cex" xmlns:w16cid="http://schemas.microsoft.com/office/word/2016/wordml/cid" xmlns:w16="http://schemas.microsoft.com/office/word/2018/wordml" xmlns:w16du="http://schemas.microsoft.com/office/word/2023/wordml/word16du" xmlns:w16sdtdh="http://schemas.microsoft.com/office/word/2020/wordml/sdtdatahash" xmlns:w16sdtfl="http://schemas.microsoft.com/office/word/2024/wordml/sdtformatlock" xmlns:w16se="http://schemas.microsoft.com/office/word/2015/wordml/symex" xmlns:wpg="http://schemas.microsoft.com/office/word/2010/wordprocessingGroup" xmlns:wpi="http://schemas.microsoft.com/office/word/2010/wordprocessingInk" xmlns:wne="http://schemas.microsoft.com/office/word/2006/wordml" xmlns:wps="http://schemas.microsoft.com/office/word/2010/wordprocessingShape" mc:Ignorable="w14 w15 w16se w16cid w16 w16cex w16sdtdh w16sdtfl w16du wp14">
+<w:document xmlns:wpc="http://schemas.microsoft.com/office/word/2010/wordprocessingCanvas" xmlns:cx="http://schemas.microsoft.com/office/drawing/2014/chartex" xmlns:cx1="http://schemas.microsoft.com/office/drawing/2015/9/8/chartex" xmlns:cx2="http://schemas.microsoft.com/office/drawing/2015/10/21/chartex" xmlns:cx3="http://schemas.microsoft.com/office/drawing/2016/5/9/chartex" xmlns:cx4="http://schemas.microsoft.com/office/drawing/2016/5/10/chartex" xmlns:cx5="http://schemas.microsoft.com/office/drawing/2016/5/11/chartex" xmlns:cx6="http://schemas.microsoft.com/office/drawing/2016/5/12/chartex" xmlns:cx7="http://schemas.microsoft.com/office/drawing/2016/5/13/chartex" xmlns:cx8="http://schemas.microsoft.com/office/drawing/2016/5/14/chartex" xmlns:mc="http://schemas.openxmlformats.org/markup-compatibility/2006" xmlns:aink="http://schemas.microsoft.com/office/drawing/2016/ink" xmlns:am3d="http://schemas.microsoft.com/office/drawing/2017/model3d" xmlns:o="urn:schemas-microsoft-com:office:office" xmlns:r="http://schemas.openxmlformats.org/officeDocument/2006/relationships" xmlns:m="http://schemas.openxmlformats.org/officeDocument/2006/math" xmlns:v="urn:schemas-microsoft-com:vml" xmlns:wp14="http://schemas.microsoft.com/office/word/2010/wordprocessingDrawing" xmlns:wp="http://schemas.openxmlformats.org/drawingml/2006/wordprocessingDrawing" xmlns:w10="urn:schemas-microsoft-com:office:word" xmlns:w="http://schemas.openxmlformats.org/wordprocessingml/2006/main" xmlns:w14="http://schemas.microsoft.com/office/word/2010/wordml" xmlns:w15="http://schemas.microsoft.com/office/word/2012/wordml" xmlns:w16cex="http://schemas.microsoft.com/office/word/2018/wordml/cex" xmlns:w16cid="http://schemas.microsoft.com/office/word/2016/wordml/cid" xmlns:w16="http://schemas.microsoft.com/office/word/2018/wordml" xmlns:w16sdtdh="http://schemas.microsoft.com/office/word/2020/wordml/sdtdatahash" xmlns:w16se="http://schemas.microsoft.com/office/word/2015/wordml/symex" xmlns:wpg="http://schemas.microsoft.com/office/word/2010/wordprocessingGroup" xmlns:wpi="http://schemas.microsoft.com/office/word/2010/wordprocessingInk" xmlns:wne="http://schemas.microsoft.com/office/word/2006/wordml" xmlns:wps="http://schemas.microsoft.com/office/word/2010/wordprocessingShape" mc:Ignorable="w14 w15 w16se w16cid w16 w16cex w16sdtdh wp14">
   <w:body>
     <w:p>
       <w:r>
@@ -240,228 +240,436 @@
     </w:p>
     <w:p/>
     <w:p>
-      <w:r>
+      <w:pPr>
         <w:rPr>
           <w:b/>
           <w:bCs/>
         </w:rPr>
-        <w:t>##### B) Puzle de patrón de colores</w:t>
-      </w:r>
-    </w:p>
-    <w:p/>
-    <w:p>
-      <w:r>
-        <w:t>- Cuatro botones de colores (rojo, azul, verde, amarillo) gestionados por `puzzle_patron-button`.</w:t>
-      </w:r>
-    </w:p>
-    <w:p>
-      <w:r>
-        <w:t>- Un gestor (`puzzle_patron-manager`) define la secuencia correcta `[0, 1, 2, 3]`.</w:t>
-      </w:r>
-    </w:p>
-    <w:p>
-      <w:r>
-        <w:lastRenderedPageBreak/>
-        <w:t>- Al acertar la secuencia completa, la puerta (`#door`) se abre con una animación hacia arriba.</w:t>
-      </w:r>
-    </w:p>
-    <w:p>
-      <w:r>
-        <w:t>- Si se falla, se resetea el progreso.</w:t>
-      </w:r>
-    </w:p>
-    <w:p/>
-    <w:p>
+      </w:pPr>
       <w:r>
         <w:rPr>
           <w:b/>
           <w:bCs/>
         </w:rPr>
-        <w:t>**Componentes involucrados**</w:t>
-      </w:r>
-      <w:r>
-        <w:t>:</w:t>
-      </w:r>
-    </w:p>
-    <w:p>
-      <w:r>
-        <w:t>| Componente | Función |</w:t>
-      </w:r>
-    </w:p>
-    <w:p>
-      <w:r>
-        <w:t>|---|---|</w:t>
-      </w:r>
-    </w:p>
-    <w:p>
-      <w:r>
-        <w:t>| `puzzle_patron-manager` | Controla la secuencia esperada y valida cada pulsación |</w:t>
-      </w:r>
-    </w:p>
-    <w:p>
-      <w:r>
-        <w:t>| `puzzle_patron-button` | Emite evento `puzzle-patron-press` con su `id` al hacer clic |</w:t>
-      </w:r>
-    </w:p>
-    <w:p/>
-    <w:p>
-      <w:r>
+        <w:br w:type="page"/>
+      </w:r>
+    </w:p>
+    <w:p>
+      <w:pPr>
         <w:rPr>
           <w:b/>
           <w:bCs/>
         </w:rPr>
-        <w:t>##### C) Sistema llave-candado con persistencia</w:t>
-      </w:r>
-    </w:p>
-    <w:p/>
-    <w:p>
-      <w:r>
-        <w:t xml:space="preserve">- Una </w:t>
-      </w:r>
+      </w:pPr>
       <w:r>
         <w:rPr>
           <w:b/>
           <w:bCs/>
         </w:rPr>
-        <w:t>**llave dorada**</w:t>
-      </w:r>
-      <w:r>
-        <w:t xml:space="preserve"> (`llave="id: llave_roja"`) que se guarda en Dexie al recogerla.</w:t>
-      </w:r>
-    </w:p>
-    <w:p>
-      <w:r>
-        <w:t xml:space="preserve">- Un </w:t>
-      </w:r>
+        <w:lastRenderedPageBreak/>
+        <w:t>B) Puzle de patrón de colores</w:t>
+      </w:r>
+    </w:p>
+    <w:p/>
+    <w:p>
+      <w:r>
+        <w:t xml:space="preserve">Realizado por: Ángel Martínez Castellanos </w:t>
+      </w:r>
+    </w:p>
+    <w:p/>
+    <w:p>
+      <w:pPr>
+        <w:pStyle w:val="Prrafodelista"/>
+        <w:numPr>
+          <w:ilvl w:val="0"/>
+          <w:numId w:val="2"/>
+        </w:numPr>
+      </w:pPr>
+      <w:r>
+        <w:t>Cuatro botones de colores (rojo, azul, verde, amarillo) gestionados por `puzzle_patron-button.</w:t>
+      </w:r>
+    </w:p>
+    <w:p>
+      <w:pPr>
+        <w:pStyle w:val="Prrafodelista"/>
+        <w:numPr>
+          <w:ilvl w:val="0"/>
+          <w:numId w:val="2"/>
+        </w:numPr>
+      </w:pPr>
+      <w:r>
+        <w:t>Un gestor (`puzzle_patron-manager`) define la secuencia correcta `[0, 1, 2, 3]`.</w:t>
+      </w:r>
+    </w:p>
+    <w:p>
+      <w:pPr>
+        <w:pStyle w:val="Prrafodelista"/>
+        <w:numPr>
+          <w:ilvl w:val="0"/>
+          <w:numId w:val="2"/>
+        </w:numPr>
+      </w:pPr>
+      <w:r>
+        <w:t>Al acertar la secuencia completa, la puerta (`#door`) se abre con una animación hacia arriba.</w:t>
+      </w:r>
+    </w:p>
+    <w:p>
+      <w:pPr>
+        <w:pStyle w:val="Prrafodelista"/>
+        <w:numPr>
+          <w:ilvl w:val="0"/>
+          <w:numId w:val="2"/>
+        </w:numPr>
+      </w:pPr>
+      <w:r>
+        <w:t>Si se falla, se resetea el progreso.</w:t>
+      </w:r>
+    </w:p>
+    <w:p>
+      <w:r>
+        <w:t>puzzle_patron-manage</w:t>
+      </w:r>
+      <w:r>
+        <w:t>r:</w:t>
+      </w:r>
+      <w:r>
+        <w:t xml:space="preserve"> Controla la secuencia esperada y valida cada pulsación </w:t>
+      </w:r>
+    </w:p>
+    <w:p>
+      <w:r>
+        <w:t>puzzle_patron-button</w:t>
+      </w:r>
+      <w:r>
+        <w:t xml:space="preserve">: </w:t>
+      </w:r>
+      <w:r>
+        <w:t xml:space="preserve">Emite evento `puzzle-patron-press` con su `id` al hacer clic </w:t>
+      </w:r>
+    </w:p>
+    <w:p/>
+    <w:p>
       <w:r>
         <w:rPr>
           <w:b/>
           <w:bCs/>
         </w:rPr>
-        <w:t>**candado**</w:t>
-      </w:r>
-      <w:r>
-        <w:t xml:space="preserve"> (`candado="llave: llave_roja"`) en una segunda puerta que comprueba el inventario.</w:t>
-      </w:r>
-    </w:p>
-    <w:p>
-      <w:r>
-        <w:t>- Al usar la llave, la puerta baja y el candado desaparece.</w:t>
-      </w:r>
-    </w:p>
-    <w:p>
-      <w:r>
-        <w:t>- El estado se persiste: si recargas la página, la puerta sigue abierta (usando la tabla `hitos` de Dexie).</w:t>
+        <w:t>C) Sistema llave-candado con persistencia</w:t>
       </w:r>
     </w:p>
     <w:p/>
     <w:p>
+      <w:r>
+        <w:t>Realizado por: Ángel Martínez Castellanos</w:t>
+      </w:r>
+    </w:p>
+    <w:p>
+      <w:pPr>
+        <w:pStyle w:val="Prrafodelista"/>
+        <w:numPr>
+          <w:ilvl w:val="0"/>
+          <w:numId w:val="3"/>
+        </w:numPr>
+      </w:pPr>
+      <w:r>
+        <w:t xml:space="preserve">Una </w:t>
+      </w:r>
       <w:r>
         <w:rPr>
           <w:b/>
           <w:bCs/>
         </w:rPr>
-        <w:t>**Tablas Dexie**</w:t>
-      </w:r>
-      <w:r>
-        <w:t>:</w:t>
-      </w:r>
-    </w:p>
-    <w:p>
-      <w:r>
-        <w:t>```javascript</w:t>
-      </w:r>
-    </w:p>
-    <w:p>
-      <w:r>
-        <w:t>db.version(1).stores({</w:t>
-      </w:r>
-    </w:p>
-    <w:p>
-      <w:r>
-        <w:t>    inventario: "id, tipo",   // Objetos recogidos (llave_roja, etc.)</w:t>
-      </w:r>
-    </w:p>
-    <w:p>
-      <w:r>
-        <w:t>    hitos: "id"               // Progreso (puerta_roja_abierta, etc.)</w:t>
-      </w:r>
-    </w:p>
-    <w:p>
-      <w:r>
-        <w:t>});</w:t>
-      </w:r>
-    </w:p>
-    <w:p>
-      <w:r>
-        <w:t>```</w:t>
-      </w:r>
-    </w:p>
-    <w:p/>
-    <w:p>
+        <w:t>llave dorada</w:t>
+      </w:r>
+      <w:r>
+        <w:t xml:space="preserve"> (llave="id: llave_</w:t>
+      </w:r>
+      <w:r>
+        <w:t>dorada</w:t>
+      </w:r>
+      <w:r>
+        <w:t>") que se guarda en Dexie al recogerla.</w:t>
+      </w:r>
+    </w:p>
+    <w:p>
+      <w:pPr>
+        <w:pStyle w:val="Prrafodelista"/>
+        <w:numPr>
+          <w:ilvl w:val="0"/>
+          <w:numId w:val="3"/>
+        </w:numPr>
+      </w:pPr>
+      <w:r>
+        <w:t xml:space="preserve">Un </w:t>
+      </w:r>
       <w:r>
         <w:rPr>
           <w:b/>
           <w:bCs/>
         </w:rPr>
-        <w:t>##### D) Jugador con físicas Ammo.js</w:t>
+        <w:t>candado</w:t>
+      </w:r>
+      <w:r>
+        <w:t xml:space="preserve"> (candado="llave: llave_</w:t>
+      </w:r>
+      <w:r>
+        <w:t>dorada</w:t>
+      </w:r>
+      <w:r>
+        <w:t>") en una segunda puerta que comprueba el inventario.</w:t>
+      </w:r>
+    </w:p>
+    <w:p>
+      <w:pPr>
+        <w:pStyle w:val="Prrafodelista"/>
+        <w:numPr>
+          <w:ilvl w:val="0"/>
+          <w:numId w:val="3"/>
+        </w:numPr>
+      </w:pPr>
+      <w:r>
+        <w:t>Al usar la llave, la puerta baja y el candado desaparece.</w:t>
+      </w:r>
+    </w:p>
+    <w:p>
+      <w:pPr>
+        <w:pStyle w:val="Prrafodelista"/>
+        <w:numPr>
+          <w:ilvl w:val="0"/>
+          <w:numId w:val="3"/>
+        </w:numPr>
+      </w:pPr>
+      <w:r>
+        <w:t>El estado se persiste: si recargas la página, la puerta sigue abierta (usando la tabla hitos de Dexie).</w:t>
       </w:r>
     </w:p>
     <w:p/>
     <w:p>
-      <w:r>
-        <w:t>Realizado por: Enrique Sequí Hernández</w:t>
-      </w:r>
-    </w:p>
-    <w:p/>
-    <w:p>
-      <w:r>
-        <w:t>- Cilindro dinámico (`ammo-body="type: dynamic"`) con masa 5.</w:t>
-      </w:r>
-    </w:p>
-    <w:p>
-      <w:r>
-        <w:t>- Movimiento WASD relativo a la dirección de la cámara.</w:t>
-      </w:r>
-    </w:p>
-    <w:p>
-      <w:r>
-        <w:t>- Gravedad 9.8 m/s², amortiguación lineal 0.9, rotación bloqueada (angularFactor: 0 0 0).</w:t>
-      </w:r>
-    </w:p>
-    <w:p>
-      <w:r>
-        <w:t>- La cámra está anidada dentro del cilindro del jugador.</w:t>
-      </w:r>
-    </w:p>
-    <w:p/>
-    <w:p>
-      <w:r>
+      <w:pPr>
         <w:rPr>
           <w:b/>
           <w:bCs/>
         </w:rPr>
-        <w:t>##### E) Colisión de mapa</w:t>
+      </w:pPr>
+      <w:r>
+        <w:rPr>
+          <w:b/>
+          <w:bCs/>
+        </w:rPr>
+        <w:t>Tablas Dexie</w:t>
+      </w:r>
+    </w:p>
+    <w:p>
+      <w:r>
+        <w:rPr>
+          <w:b/>
+          <w:bCs/>
+        </w:rPr>
+        <w:br/>
+      </w:r>
+      <w:r>
+        <w:t>Realizado por: Ángel Martínez Castellanos</w:t>
+      </w:r>
+    </w:p>
+    <w:p>
+      <w:r>
+        <w:t>db.version(1).stores({</w:t>
+      </w:r>
+    </w:p>
+    <w:p>
+      <w:r>
+        <w:t>    inventario: "id, tipo",   // Objetos recogidos (llave_roja, etc.)</w:t>
+      </w:r>
+    </w:p>
+    <w:p>
+      <w:r>
+        <w:t>    hitos: "id"               // Progreso (puerta_roja_abierta, etc.)</w:t>
+      </w:r>
+    </w:p>
+    <w:p>
+      <w:r>
+        <w:t>});</w:t>
+      </w:r>
+    </w:p>
+    <w:p>
+      <w:pPr>
+        <w:rPr>
+          <w:u w:val="single"/>
+        </w:rPr>
+      </w:pPr>
+      <w:r>
+        <w:rPr>
+          <w:u w:val="single"/>
+        </w:rPr>
+        <w:t>Visualización tabla hitos</w:t>
+      </w:r>
+    </w:p>
+    <w:p>
+      <w:r>
+        <w:rPr>
+          <w:noProof/>
+        </w:rPr>
+        <w:drawing>
+          <wp:inline distT="0" distB="0" distL="0" distR="0" wp14:anchorId="27717B9A" wp14:editId="0E05EBC9">
+            <wp:extent cx="5400040" cy="930275"/>
+            <wp:effectExtent l="0" t="0" r="0" b="3175"/>
+            <wp:docPr id="1" name="Imagen 1"/>
+            <wp:cNvGraphicFramePr>
+              <a:graphicFrameLocks xmlns:a="http://schemas.openxmlformats.org/drawingml/2006/main" noChangeAspect="1"/>
+            </wp:cNvGraphicFramePr>
+            <a:graphic xmlns:a="http://schemas.openxmlformats.org/drawingml/2006/main">
+              <a:graphicData uri="http://schemas.openxmlformats.org/drawingml/2006/picture">
+                <pic:pic xmlns:pic="http://schemas.openxmlformats.org/drawingml/2006/picture">
+                  <pic:nvPicPr>
+                    <pic:cNvPr id="1" name=""/>
+                    <pic:cNvPicPr/>
+                  </pic:nvPicPr>
+                  <pic:blipFill>
+                    <a:blip r:embed="rId5"/>
+                    <a:stretch>
+                      <a:fillRect/>
+                    </a:stretch>
+                  </pic:blipFill>
+                  <pic:spPr>
+                    <a:xfrm>
+                      <a:off x="0" y="0"/>
+                      <a:ext cx="5400040" cy="930275"/>
+                    </a:xfrm>
+                    <a:prstGeom prst="rect">
+                      <a:avLst/>
+                    </a:prstGeom>
+                  </pic:spPr>
+                </pic:pic>
+              </a:graphicData>
+            </a:graphic>
+          </wp:inline>
+        </w:drawing>
+      </w:r>
+    </w:p>
+    <w:p>
+      <w:r>
+        <w:t>Visualización tabla inventario</w:t>
+      </w:r>
+    </w:p>
+    <w:p>
+      <w:r>
+        <w:rPr>
+          <w:noProof/>
+        </w:rPr>
+        <w:drawing>
+          <wp:inline distT="0" distB="0" distL="0" distR="0" wp14:anchorId="49F596D2" wp14:editId="432EECDF">
+            <wp:extent cx="5400040" cy="831215"/>
+            <wp:effectExtent l="0" t="0" r="0" b="6985"/>
+            <wp:docPr id="2" name="Imagen 2"/>
+            <wp:cNvGraphicFramePr>
+              <a:graphicFrameLocks xmlns:a="http://schemas.openxmlformats.org/drawingml/2006/main" noChangeAspect="1"/>
+            </wp:cNvGraphicFramePr>
+            <a:graphic xmlns:a="http://schemas.openxmlformats.org/drawingml/2006/main">
+              <a:graphicData uri="http://schemas.openxmlformats.org/drawingml/2006/picture">
+                <pic:pic xmlns:pic="http://schemas.openxmlformats.org/drawingml/2006/picture">
+                  <pic:nvPicPr>
+                    <pic:cNvPr id="1" name=""/>
+                    <pic:cNvPicPr/>
+                  </pic:nvPicPr>
+                  <pic:blipFill>
+                    <a:blip r:embed="rId6"/>
+                    <a:stretch>
+                      <a:fillRect/>
+                    </a:stretch>
+                  </pic:blipFill>
+                  <pic:spPr>
+                    <a:xfrm>
+                      <a:off x="0" y="0"/>
+                      <a:ext cx="5400040" cy="831215"/>
+                    </a:xfrm>
+                    <a:prstGeom prst="rect">
+                      <a:avLst/>
+                    </a:prstGeom>
+                  </pic:spPr>
+                </pic:pic>
+              </a:graphicData>
+            </a:graphic>
+          </wp:inline>
+        </w:drawing>
       </w:r>
     </w:p>
     <w:p/>
     <w:p>
       <w:r>
+        <w:rPr>
+          <w:b/>
+          <w:bCs/>
+        </w:rPr>
+        <w:lastRenderedPageBreak/>
+        <w:t>D) Jugador con físicas Ammo.js</w:t>
+      </w:r>
+    </w:p>
+    <w:p/>
+    <w:p>
+      <w:r>
         <w:t>Realizado por: Enrique Sequí Hernández</w:t>
       </w:r>
     </w:p>
     <w:p/>
     <w:p>
-      <w:r>
-        <w:t>- Componente `colision-ammo`: espera a que el modelo GLTF cargue y aplica `ammo-body: static` + `ammo-shape: mesh`.</w:t>
+      <w:pPr>
+        <w:pStyle w:val="Prrafodelista"/>
+        <w:numPr>
+          <w:ilvl w:val="0"/>
+          <w:numId w:val="4"/>
+        </w:numPr>
+      </w:pPr>
+      <w:r>
+        <w:t>Cilindro dinámico (`ammo-body="type: dynamic"`) con masa 5. Movimiento WASD relativo a la dirección de la cámara.</w:t>
+      </w:r>
+    </w:p>
+    <w:p>
+      <w:pPr>
+        <w:pStyle w:val="Prrafodelista"/>
+        <w:numPr>
+          <w:ilvl w:val="0"/>
+          <w:numId w:val="4"/>
+        </w:numPr>
+      </w:pPr>
+      <w:r>
+        <w:t>Gravedad 9.8 m/s², amortiguación lineal 0.9, rotación bloqueada (angularFactor: 0 0 0).</w:t>
+      </w:r>
+    </w:p>
+    <w:p>
+      <w:pPr>
+        <w:pStyle w:val="Prrafodelista"/>
+        <w:numPr>
+          <w:ilvl w:val="0"/>
+          <w:numId w:val="4"/>
+        </w:numPr>
+      </w:pPr>
+      <w:r>
+        <w:t>La cámra está anidada dentro del cilindro del jugador.</w:t>
       </w:r>
     </w:p>
     <w:p/>
     <w:p>
       <w:r>
-        <w:t>---</w:t>
-      </w:r>
-    </w:p>
+        <w:rPr>
+          <w:b/>
+          <w:bCs/>
+        </w:rPr>
+        <w:t>E) Colisión de mapa</w:t>
+      </w:r>
+    </w:p>
+    <w:p/>
+    <w:p>
+      <w:r>
+        <w:t>Realizado por: Enrique Sequí Hernández</w:t>
+      </w:r>
+    </w:p>
+    <w:p/>
+    <w:p>
+      <w:r>
+        <w:t>Componente `colision-ammo`: espera a que el modelo GLTF cargue y aplica `ammo-body: static` + `ammo-shape: mesh`.</w:t>
+      </w:r>
+    </w:p>
+    <w:p/>
     <w:p/>
     <w:sectPr>
       <w:pgSz w:w="11906" w:h="16838"/>
@@ -474,8 +682,347 @@
 </file>
 
 <file path=word/numbering.xml><?xml version="1.0" encoding="utf-8"?>
-<w:numbering xmlns:wpc="http://schemas.microsoft.com/office/word/2010/wordprocessingCanvas" xmlns:cx="http://schemas.microsoft.com/office/drawing/2014/chartex" xmlns:cx1="http://schemas.microsoft.com/office/drawing/2015/9/8/chartex" xmlns:cx2="http://schemas.microsoft.com/office/drawing/2015/10/21/chartex" xmlns:cx3="http://schemas.microsoft.com/office/drawing/2016/5/9/chartex" xmlns:cx4="http://schemas.microsoft.com/office/drawing/2016/5/10/chartex" xmlns:cx5="http://schemas.microsoft.com/office/drawing/2016/5/11/chartex" xmlns:cx6="http://schemas.microsoft.com/office/drawing/2016/5/12/chartex" xmlns:cx7="http://schemas.microsoft.com/office/drawing/2016/5/13/chartex" xmlns:cx8="http://schemas.microsoft.com/office/drawing/2016/5/14/chartex" xmlns:mc="http://schemas.openxmlformats.org/markup-compatibility/2006" xmlns:aink="http://schemas.microsoft.com/office/drawing/2016/ink" xmlns:am3d="http://schemas.microsoft.com/office/drawing/2017/model3d" xmlns:o="urn:schemas-microsoft-com:office:office" xmlns:oel="http://schemas.microsoft.com/office/2019/extlst" xmlns:r="http://schemas.openxmlformats.org/officeDocument/2006/relationships" xmlns:m="http://schemas.openxmlformats.org/officeDocument/2006/math" xmlns:v="urn:schemas-microsoft-com:vml" xmlns:wp14="http://schemas.microsoft.com/office/word/2010/wordprocessingDrawing" xmlns:wp="http://schemas.openxmlformats.org/drawingml/2006/wordprocessingDrawing" xmlns:w10="urn:schemas-microsoft-com:office:word" xmlns:w="http://schemas.openxmlformats.org/wordprocessingml/2006/main" xmlns:w14="http://schemas.microsoft.com/office/word/2010/wordml" xmlns:w15="http://schemas.microsoft.com/office/word/2012/wordml" xmlns:w16cex="http://schemas.microsoft.com/office/word/2018/wordml/cex" xmlns:w16cid="http://schemas.microsoft.com/office/word/2016/wordml/cid" xmlns:w16="http://schemas.microsoft.com/office/word/2018/wordml" xmlns:w16du="http://schemas.microsoft.com/office/word/2023/wordml/word16du" xmlns:w16sdtdh="http://schemas.microsoft.com/office/word/2020/wordml/sdtdatahash" xmlns:w16sdtfl="http://schemas.microsoft.com/office/word/2024/wordml/sdtformatlock" xmlns:w16se="http://schemas.microsoft.com/office/word/2015/wordml/symex" xmlns:wpg="http://schemas.microsoft.com/office/word/2010/wordprocessingGroup" xmlns:wpi="http://schemas.microsoft.com/office/word/2010/wordprocessingInk" xmlns:wne="http://schemas.microsoft.com/office/word/2006/wordml" xmlns:wps="http://schemas.microsoft.com/office/word/2010/wordprocessingShape" mc:Ignorable="w14 w15 w16se w16cid w16 w16cex w16sdtdh w16sdtfl w16du wp14">
+<w:numbering xmlns:wpc="http://schemas.microsoft.com/office/word/2010/wordprocessingCanvas" xmlns:cx="http://schemas.microsoft.com/office/drawing/2014/chartex" xmlns:cx1="http://schemas.microsoft.com/office/drawing/2015/9/8/chartex" xmlns:cx2="http://schemas.microsoft.com/office/drawing/2015/10/21/chartex" xmlns:cx3="http://schemas.microsoft.com/office/drawing/2016/5/9/chartex" xmlns:cx4="http://schemas.microsoft.com/office/drawing/2016/5/10/chartex" xmlns:cx5="http://schemas.microsoft.com/office/drawing/2016/5/11/chartex" xmlns:cx6="http://schemas.microsoft.com/office/drawing/2016/5/12/chartex" xmlns:cx7="http://schemas.microsoft.com/office/drawing/2016/5/13/chartex" xmlns:cx8="http://schemas.microsoft.com/office/drawing/2016/5/14/chartex" xmlns:mc="http://schemas.openxmlformats.org/markup-compatibility/2006" xmlns:aink="http://schemas.microsoft.com/office/drawing/2016/ink" xmlns:am3d="http://schemas.microsoft.com/office/drawing/2017/model3d" xmlns:o="urn:schemas-microsoft-com:office:office" xmlns:r="http://schemas.openxmlformats.org/officeDocument/2006/relationships" xmlns:m="http://schemas.openxmlformats.org/officeDocument/2006/math" xmlns:v="urn:schemas-microsoft-com:vml" xmlns:wp14="http://schemas.microsoft.com/office/word/2010/wordprocessingDrawing" xmlns:wp="http://schemas.openxmlformats.org/drawingml/2006/wordprocessingDrawing" xmlns:w10="urn:schemas-microsoft-com:office:word" xmlns:w="http://schemas.openxmlformats.org/wordprocessingml/2006/main" xmlns:w14="http://schemas.microsoft.com/office/word/2010/wordml" xmlns:w15="http://schemas.microsoft.com/office/word/2012/wordml" xmlns:w16cex="http://schemas.microsoft.com/office/word/2018/wordml/cex" xmlns:w16cid="http://schemas.microsoft.com/office/word/2016/wordml/cid" xmlns:w16="http://schemas.microsoft.com/office/word/2018/wordml" xmlns:w16sdtdh="http://schemas.microsoft.com/office/word/2020/wordml/sdtdatahash" xmlns:w16se="http://schemas.microsoft.com/office/word/2015/wordml/symex" xmlns:wpg="http://schemas.microsoft.com/office/word/2010/wordprocessingGroup" xmlns:wpi="http://schemas.microsoft.com/office/word/2010/wordprocessingInk" xmlns:wne="http://schemas.microsoft.com/office/word/2006/wordml" xmlns:wps="http://schemas.microsoft.com/office/word/2010/wordprocessingShape" mc:Ignorable="w14 w15 w16se w16cid w16 w16cex w16sdtdh wp14">
   <w:abstractNum w:abstractNumId="0" w15:restartNumberingAfterBreak="0">
+    <w:nsid w:val="3F0E4DBA"/>
+    <w:multiLevelType w:val="hybridMultilevel"/>
+    <w:tmpl w:val="3E9C7226"/>
+    <w:lvl w:ilvl="0" w:tplc="0C0A0001">
+      <w:start w:val="1"/>
+      <w:numFmt w:val="bullet"/>
+      <w:lvlText w:val=""/>
+      <w:lvlJc w:val="left"/>
+      <w:pPr>
+        <w:ind w:left="720" w:hanging="360"/>
+      </w:pPr>
+      <w:rPr>
+        <w:rFonts w:ascii="Symbol" w:hAnsi="Symbol" w:hint="default"/>
+      </w:rPr>
+    </w:lvl>
+    <w:lvl w:ilvl="1" w:tplc="0C0A0003" w:tentative="1">
+      <w:start w:val="1"/>
+      <w:numFmt w:val="bullet"/>
+      <w:lvlText w:val="o"/>
+      <w:lvlJc w:val="left"/>
+      <w:pPr>
+        <w:ind w:left="1440" w:hanging="360"/>
+      </w:pPr>
+      <w:rPr>
+        <w:rFonts w:ascii="Courier New" w:hAnsi="Courier New" w:cs="Courier New" w:hint="default"/>
+      </w:rPr>
+    </w:lvl>
+    <w:lvl w:ilvl="2" w:tplc="0C0A0005" w:tentative="1">
+      <w:start w:val="1"/>
+      <w:numFmt w:val="bullet"/>
+      <w:lvlText w:val=""/>
+      <w:lvlJc w:val="left"/>
+      <w:pPr>
+        <w:ind w:left="2160" w:hanging="360"/>
+      </w:pPr>
+      <w:rPr>
+        <w:rFonts w:ascii="Wingdings" w:hAnsi="Wingdings" w:hint="default"/>
+      </w:rPr>
+    </w:lvl>
+    <w:lvl w:ilvl="3" w:tplc="0C0A0001" w:tentative="1">
+      <w:start w:val="1"/>
+      <w:numFmt w:val="bullet"/>
+      <w:lvlText w:val=""/>
+      <w:lvlJc w:val="left"/>
+      <w:pPr>
+        <w:ind w:left="2880" w:hanging="360"/>
+      </w:pPr>
+      <w:rPr>
+        <w:rFonts w:ascii="Symbol" w:hAnsi="Symbol" w:hint="default"/>
+      </w:rPr>
+    </w:lvl>
+    <w:lvl w:ilvl="4" w:tplc="0C0A0003" w:tentative="1">
+      <w:start w:val="1"/>
+      <w:numFmt w:val="bullet"/>
+      <w:lvlText w:val="o"/>
+      <w:lvlJc w:val="left"/>
+      <w:pPr>
+        <w:ind w:left="3600" w:hanging="360"/>
+      </w:pPr>
+      <w:rPr>
+        <w:rFonts w:ascii="Courier New" w:hAnsi="Courier New" w:cs="Courier New" w:hint="default"/>
+      </w:rPr>
+    </w:lvl>
+    <w:lvl w:ilvl="5" w:tplc="0C0A0005" w:tentative="1">
+      <w:start w:val="1"/>
+      <w:numFmt w:val="bullet"/>
+      <w:lvlText w:val=""/>
+      <w:lvlJc w:val="left"/>
+      <w:pPr>
+        <w:ind w:left="4320" w:hanging="360"/>
+      </w:pPr>
+      <w:rPr>
+        <w:rFonts w:ascii="Wingdings" w:hAnsi="Wingdings" w:hint="default"/>
+      </w:rPr>
+    </w:lvl>
+    <w:lvl w:ilvl="6" w:tplc="0C0A0001" w:tentative="1">
+      <w:start w:val="1"/>
+      <w:numFmt w:val="bullet"/>
+      <w:lvlText w:val=""/>
+      <w:lvlJc w:val="left"/>
+      <w:pPr>
+        <w:ind w:left="5040" w:hanging="360"/>
+      </w:pPr>
+      <w:rPr>
+        <w:rFonts w:ascii="Symbol" w:hAnsi="Symbol" w:hint="default"/>
+      </w:rPr>
+    </w:lvl>
+    <w:lvl w:ilvl="7" w:tplc="0C0A0003" w:tentative="1">
+      <w:start w:val="1"/>
+      <w:numFmt w:val="bullet"/>
+      <w:lvlText w:val="o"/>
+      <w:lvlJc w:val="left"/>
+      <w:pPr>
+        <w:ind w:left="5760" w:hanging="360"/>
+      </w:pPr>
+      <w:rPr>
+        <w:rFonts w:ascii="Courier New" w:hAnsi="Courier New" w:cs="Courier New" w:hint="default"/>
+      </w:rPr>
+    </w:lvl>
+    <w:lvl w:ilvl="8" w:tplc="0C0A0005" w:tentative="1">
+      <w:start w:val="1"/>
+      <w:numFmt w:val="bullet"/>
+      <w:lvlText w:val=""/>
+      <w:lvlJc w:val="left"/>
+      <w:pPr>
+        <w:ind w:left="6480" w:hanging="360"/>
+      </w:pPr>
+      <w:rPr>
+        <w:rFonts w:ascii="Wingdings" w:hAnsi="Wingdings" w:hint="default"/>
+      </w:rPr>
+    </w:lvl>
+  </w:abstractNum>
+  <w:abstractNum w:abstractNumId="1" w15:restartNumberingAfterBreak="0">
+    <w:nsid w:val="5B5B6EBF"/>
+    <w:multiLevelType w:val="hybridMultilevel"/>
+    <w:tmpl w:val="E9D42552"/>
+    <w:lvl w:ilvl="0" w:tplc="0C0A0001">
+      <w:start w:val="1"/>
+      <w:numFmt w:val="bullet"/>
+      <w:lvlText w:val=""/>
+      <w:lvlJc w:val="left"/>
+      <w:pPr>
+        <w:ind w:left="720" w:hanging="360"/>
+      </w:pPr>
+      <w:rPr>
+        <w:rFonts w:ascii="Symbol" w:hAnsi="Symbol" w:hint="default"/>
+      </w:rPr>
+    </w:lvl>
+    <w:lvl w:ilvl="1" w:tplc="0C0A0003" w:tentative="1">
+      <w:start w:val="1"/>
+      <w:numFmt w:val="bullet"/>
+      <w:lvlText w:val="o"/>
+      <w:lvlJc w:val="left"/>
+      <w:pPr>
+        <w:ind w:left="1440" w:hanging="360"/>
+      </w:pPr>
+      <w:rPr>
+        <w:rFonts w:ascii="Courier New" w:hAnsi="Courier New" w:cs="Courier New" w:hint="default"/>
+      </w:rPr>
+    </w:lvl>
+    <w:lvl w:ilvl="2" w:tplc="0C0A0005" w:tentative="1">
+      <w:start w:val="1"/>
+      <w:numFmt w:val="bullet"/>
+      <w:lvlText w:val=""/>
+      <w:lvlJc w:val="left"/>
+      <w:pPr>
+        <w:ind w:left="2160" w:hanging="360"/>
+      </w:pPr>
+      <w:rPr>
+        <w:rFonts w:ascii="Wingdings" w:hAnsi="Wingdings" w:hint="default"/>
+      </w:rPr>
+    </w:lvl>
+    <w:lvl w:ilvl="3" w:tplc="0C0A0001" w:tentative="1">
+      <w:start w:val="1"/>
+      <w:numFmt w:val="bullet"/>
+      <w:lvlText w:val=""/>
+      <w:lvlJc w:val="left"/>
+      <w:pPr>
+        <w:ind w:left="2880" w:hanging="360"/>
+      </w:pPr>
+      <w:rPr>
+        <w:rFonts w:ascii="Symbol" w:hAnsi="Symbol" w:hint="default"/>
+      </w:rPr>
+    </w:lvl>
+    <w:lvl w:ilvl="4" w:tplc="0C0A0003" w:tentative="1">
+      <w:start w:val="1"/>
+      <w:numFmt w:val="bullet"/>
+      <w:lvlText w:val="o"/>
+      <w:lvlJc w:val="left"/>
+      <w:pPr>
+        <w:ind w:left="3600" w:hanging="360"/>
+      </w:pPr>
+      <w:rPr>
+        <w:rFonts w:ascii="Courier New" w:hAnsi="Courier New" w:cs="Courier New" w:hint="default"/>
+      </w:rPr>
+    </w:lvl>
+    <w:lvl w:ilvl="5" w:tplc="0C0A0005" w:tentative="1">
+      <w:start w:val="1"/>
+      <w:numFmt w:val="bullet"/>
+      <w:lvlText w:val=""/>
+      <w:lvlJc w:val="left"/>
+      <w:pPr>
+        <w:ind w:left="4320" w:hanging="360"/>
+      </w:pPr>
+      <w:rPr>
+        <w:rFonts w:ascii="Wingdings" w:hAnsi="Wingdings" w:hint="default"/>
+      </w:rPr>
+    </w:lvl>
+    <w:lvl w:ilvl="6" w:tplc="0C0A0001" w:tentative="1">
+      <w:start w:val="1"/>
+      <w:numFmt w:val="bullet"/>
+      <w:lvlText w:val=""/>
+      <w:lvlJc w:val="left"/>
+      <w:pPr>
+        <w:ind w:left="5040" w:hanging="360"/>
+      </w:pPr>
+      <w:rPr>
+        <w:rFonts w:ascii="Symbol" w:hAnsi="Symbol" w:hint="default"/>
+      </w:rPr>
+    </w:lvl>
+    <w:lvl w:ilvl="7" w:tplc="0C0A0003" w:tentative="1">
+      <w:start w:val="1"/>
+      <w:numFmt w:val="bullet"/>
+      <w:lvlText w:val="o"/>
+      <w:lvlJc w:val="left"/>
+      <w:pPr>
+        <w:ind w:left="5760" w:hanging="360"/>
+      </w:pPr>
+      <w:rPr>
+        <w:rFonts w:ascii="Courier New" w:hAnsi="Courier New" w:cs="Courier New" w:hint="default"/>
+      </w:rPr>
+    </w:lvl>
+    <w:lvl w:ilvl="8" w:tplc="0C0A0005" w:tentative="1">
+      <w:start w:val="1"/>
+      <w:numFmt w:val="bullet"/>
+      <w:lvlText w:val=""/>
+      <w:lvlJc w:val="left"/>
+      <w:pPr>
+        <w:ind w:left="6480" w:hanging="360"/>
+      </w:pPr>
+      <w:rPr>
+        <w:rFonts w:ascii="Wingdings" w:hAnsi="Wingdings" w:hint="default"/>
+      </w:rPr>
+    </w:lvl>
+  </w:abstractNum>
+  <w:abstractNum w:abstractNumId="2" w15:restartNumberingAfterBreak="0">
+    <w:nsid w:val="6BDE724E"/>
+    <w:multiLevelType w:val="hybridMultilevel"/>
+    <w:tmpl w:val="EEB06404"/>
+    <w:lvl w:ilvl="0" w:tplc="0C0A0001">
+      <w:start w:val="1"/>
+      <w:numFmt w:val="bullet"/>
+      <w:lvlText w:val=""/>
+      <w:lvlJc w:val="left"/>
+      <w:pPr>
+        <w:ind w:left="720" w:hanging="360"/>
+      </w:pPr>
+      <w:rPr>
+        <w:rFonts w:ascii="Symbol" w:hAnsi="Symbol" w:hint="default"/>
+      </w:rPr>
+    </w:lvl>
+    <w:lvl w:ilvl="1" w:tplc="0C0A0003" w:tentative="1">
+      <w:start w:val="1"/>
+      <w:numFmt w:val="bullet"/>
+      <w:lvlText w:val="o"/>
+      <w:lvlJc w:val="left"/>
+      <w:pPr>
+        <w:ind w:left="1440" w:hanging="360"/>
+      </w:pPr>
+      <w:rPr>
+        <w:rFonts w:ascii="Courier New" w:hAnsi="Courier New" w:cs="Courier New" w:hint="default"/>
+      </w:rPr>
+    </w:lvl>
+    <w:lvl w:ilvl="2" w:tplc="0C0A0005" w:tentative="1">
+      <w:start w:val="1"/>
+      <w:numFmt w:val="bullet"/>
+      <w:lvlText w:val=""/>
+      <w:lvlJc w:val="left"/>
+      <w:pPr>
+        <w:ind w:left="2160" w:hanging="360"/>
+      </w:pPr>
+      <w:rPr>
+        <w:rFonts w:ascii="Wingdings" w:hAnsi="Wingdings" w:hint="default"/>
+      </w:rPr>
+    </w:lvl>
+    <w:lvl w:ilvl="3" w:tplc="0C0A0001" w:tentative="1">
+      <w:start w:val="1"/>
+      <w:numFmt w:val="bullet"/>
+      <w:lvlText w:val=""/>
+      <w:lvlJc w:val="left"/>
+      <w:pPr>
+        <w:ind w:left="2880" w:hanging="360"/>
+      </w:pPr>
+      <w:rPr>
+        <w:rFonts w:ascii="Symbol" w:hAnsi="Symbol" w:hint="default"/>
+      </w:rPr>
+    </w:lvl>
+    <w:lvl w:ilvl="4" w:tplc="0C0A0003" w:tentative="1">
+      <w:start w:val="1"/>
+      <w:numFmt w:val="bullet"/>
+      <w:lvlText w:val="o"/>
+      <w:lvlJc w:val="left"/>
+      <w:pPr>
+        <w:ind w:left="3600" w:hanging="360"/>
+      </w:pPr>
+      <w:rPr>
+        <w:rFonts w:ascii="Courier New" w:hAnsi="Courier New" w:cs="Courier New" w:hint="default"/>
+      </w:rPr>
+    </w:lvl>
+    <w:lvl w:ilvl="5" w:tplc="0C0A0005" w:tentative="1">
+      <w:start w:val="1"/>
+      <w:numFmt w:val="bullet"/>
+      <w:lvlText w:val=""/>
+      <w:lvlJc w:val="left"/>
+      <w:pPr>
+        <w:ind w:left="4320" w:hanging="360"/>
+      </w:pPr>
+      <w:rPr>
+        <w:rFonts w:ascii="Wingdings" w:hAnsi="Wingdings" w:hint="default"/>
+      </w:rPr>
+    </w:lvl>
+    <w:lvl w:ilvl="6" w:tplc="0C0A0001" w:tentative="1">
+      <w:start w:val="1"/>
+      <w:numFmt w:val="bullet"/>
+      <w:lvlText w:val=""/>
+      <w:lvlJc w:val="left"/>
+      <w:pPr>
+        <w:ind w:left="5040" w:hanging="360"/>
+      </w:pPr>
+      <w:rPr>
+        <w:rFonts w:ascii="Symbol" w:hAnsi="Symbol" w:hint="default"/>
+      </w:rPr>
+    </w:lvl>
+    <w:lvl w:ilvl="7" w:tplc="0C0A0003" w:tentative="1">
+      <w:start w:val="1"/>
+      <w:numFmt w:val="bullet"/>
+      <w:lvlText w:val="o"/>
+      <w:lvlJc w:val="left"/>
+      <w:pPr>
+        <w:ind w:left="5760" w:hanging="360"/>
+      </w:pPr>
+      <w:rPr>
+        <w:rFonts w:ascii="Courier New" w:hAnsi="Courier New" w:cs="Courier New" w:hint="default"/>
+      </w:rPr>
+    </w:lvl>
+    <w:lvl w:ilvl="8" w:tplc="0C0A0005" w:tentative="1">
+      <w:start w:val="1"/>
+      <w:numFmt w:val="bullet"/>
+      <w:lvlText w:val=""/>
+      <w:lvlJc w:val="left"/>
+      <w:pPr>
+        <w:ind w:left="6480" w:hanging="360"/>
+      </w:pPr>
+      <w:rPr>
+        <w:rFonts w:ascii="Wingdings" w:hAnsi="Wingdings" w:hint="default"/>
+      </w:rPr>
+    </w:lvl>
+  </w:abstractNum>
+  <w:abstractNum w:abstractNumId="3" w15:restartNumberingAfterBreak="0">
     <w:nsid w:val="7EA440D6"/>
     <w:multiLevelType w:val="hybridMultilevel"/>
     <w:tmpl w:val="43128670"/>
@@ -588,14 +1135,23 @@
       </w:rPr>
     </w:lvl>
   </w:abstractNum>
-  <w:num w:numId="1" w16cid:durableId="2084645026">
+  <w:num w:numId="1">
+    <w:abstractNumId w:val="3"/>
+  </w:num>
+  <w:num w:numId="2">
+    <w:abstractNumId w:val="2"/>
+  </w:num>
+  <w:num w:numId="3">
     <w:abstractNumId w:val="0"/>
+  </w:num>
+  <w:num w:numId="4">
+    <w:abstractNumId w:val="1"/>
   </w:num>
 </w:numbering>
 </file>
 
 <file path=word/styles.xml><?xml version="1.0" encoding="utf-8"?>
-<w:styles xmlns:mc="http://schemas.openxmlformats.org/markup-compatibility/2006" xmlns:r="http://schemas.openxmlformats.org/officeDocument/2006/relationships" xmlns:w="http://schemas.openxmlformats.org/wordprocessingml/2006/main" xmlns:w14="http://schemas.microsoft.com/office/word/2010/wordml" xmlns:w15="http://schemas.microsoft.com/office/word/2012/wordml" xmlns:w16cex="http://schemas.microsoft.com/office/word/2018/wordml/cex" xmlns:w16cid="http://schemas.microsoft.com/office/word/2016/wordml/cid" xmlns:w16="http://schemas.microsoft.com/office/word/2018/wordml" xmlns:w16du="http://schemas.microsoft.com/office/word/2023/wordml/word16du" xmlns:w16sdtdh="http://schemas.microsoft.com/office/word/2020/wordml/sdtdatahash" xmlns:w16sdtfl="http://schemas.microsoft.com/office/word/2024/wordml/sdtformatlock" xmlns:w16se="http://schemas.microsoft.com/office/word/2015/wordml/symex" mc:Ignorable="w14 w15 w16se w16cid w16 w16cex w16sdtdh w16sdtfl w16du">
+<w:styles xmlns:mc="http://schemas.openxmlformats.org/markup-compatibility/2006" xmlns:r="http://schemas.openxmlformats.org/officeDocument/2006/relationships" xmlns:w="http://schemas.openxmlformats.org/wordprocessingml/2006/main" xmlns:w14="http://schemas.microsoft.com/office/word/2010/wordml" xmlns:w15="http://schemas.microsoft.com/office/word/2012/wordml" xmlns:w16cex="http://schemas.microsoft.com/office/word/2018/wordml/cex" xmlns:w16cid="http://schemas.microsoft.com/office/word/2016/wordml/cid" xmlns:w16="http://schemas.microsoft.com/office/word/2018/wordml" xmlns:w16sdtdh="http://schemas.microsoft.com/office/word/2020/wordml/sdtdatahash" xmlns:w16se="http://schemas.microsoft.com/office/word/2015/wordml/symex" mc:Ignorable="w14 w15 w16se w16cid w16 w16cex w16sdtdh">
   <w:docDefaults>
     <w:rPrDefault>
       <w:rPr>

</xml_diff>